<commit_message>
docs: record clean-clone CPU CUDA readiness
</commit_message>
<xml_diff>
--- a/Software Validation from Datasets/Evaluation Tool/docs/automated_evaluation/Word Documents/1_launch_control_sheet.docx
+++ b/Software Validation from Datasets/Evaluation Tool/docs/automated_evaluation/Word Documents/1_launch_control_sheet.docx
@@ -47,7 +47,7 @@
                 <w:b/>
                 <w:color w:val="7F6000"/>
               </w:rPr>
-              <w:t>Overall verdict: NOT_READY_TO_LAUNCH. CPU and CUDA are supported execution modes. Machine A must finish clean-clone preflight for the selected mode; Machine B and the canary/small/standard scientific gates remain mandatory.</w:t>
+              <w:t>Overall verdict: NOT_READY_TO_LAUNCH. CPU and CUDA are supported execution modes, and Machine A passed separate clean-clone setup, real evaluator smoke, release binding, and complete 20-scenario preflight for both. Machine B and the canary/small/standard scientific gates remain mandatory.</w:t>
             </w:r>
           </w:p>
         </w:tc>
@@ -1032,7 +1032,7 @@
               <w:rPr>
                 <w:sz w:val="14"/>
               </w:rPr>
-              <w:t>CUDA-qualified; final clean binding/preflight required</w:t>
+              <w:t>CPU and CUDA clean-clone preflights passed 20/20</w:t>
             </w:r>
           </w:p>
         </w:tc>
@@ -1671,7 +1671,7 @@
         <w:pStyle w:val="ListNumber"/>
       </w:pPr>
       <w:r>
-        <w:t>Finish final clean-clone CPU and CUDA bindings and complete both Machine A preflights.</w:t>
+        <w:t>Install, profile, run a real smoke, and fully preflight Machine B; do not copy Machine A evidence.</w:t>
       </w:r>
     </w:p>
     <w:p>
@@ -1679,7 +1679,7 @@
         <w:pStyle w:val="ListNumber"/>
       </w:pPr>
       <w:r>
-        <w:t>Install, profile, and fully preflight Machine B; do not copy Machine A evidence.</w:t>
+        <w:t>Confirm both workers materialize the same selected CPU or CUDA campaign at the same approved final commit and retain zero-overlap assignments.</w:t>
       </w:r>
     </w:p>
     <w:p>

</xml_diff>